<commit_message>
generated docx files and cleaned up the directory
</commit_message>
<xml_diff>
--- a/refactors/lsp_BnkGetNextNonAssignableRx/Recommendation.docx
+++ b/refactors/lsp_BnkGetNextNonAssignableRx/Recommendation.docx
@@ -44,7 +44,7 @@
         <w:rPr>
           <w:rStyle w:val="VerbatimChar"/>
         </w:rPr>
-        <w:t xml:space="preserve">Analysis.md</w:t>
+        <w:t xml:space="preserve">Analysis.docx</w:t>
       </w:r>
       <w:r>
         <w:t xml:space="preserve"> </w:t>
@@ -1674,7 +1674,7 @@
   <w:docDefaults>
     <w:rPrDefault>
       <w:rPr>
-        <w:rFonts w:ascii="Aptos" w:hAnsi="Aptos" w:cs="Aptos" w:asciiTheme="minorHAnsi" w:eastAsiaTheme="minorHAnsi" w:hAnsiTheme="minorHAnsi" w:cstheme="minorBidi"/>
+        <w:rFonts w:ascii="Arial" w:hAnsi="Arial" w:cs="Arial" w:asciiTheme="minorHAnsi" w:eastAsiaTheme="minorHAnsi" w:hAnsiTheme="minorHAnsi" w:cstheme="minorBidi"/>
         <w:sz w:val="24"/>
         <w:szCs w:val="24"/>
         <w:lang w:val="en-US" w:eastAsia="en-US" w:bidi="ar-SA"/>
@@ -2392,7 +2392,7 @@
     </a:clrScheme>
     <a:fontScheme name="Office">
       <a:majorFont>
-        <a:latin typeface="Aptos"/>
+        <a:latin typeface="Arial"/>
         <a:ea typeface=""/>
         <a:cs typeface=""/>
         <a:font script="Jpan" typeface="ＭＳ ゴシック"/>
@@ -2426,7 +2426,7 @@
         <a:font script="Uigh" typeface="Microsoft Uighur"/>
       </a:majorFont>
       <a:minorFont>
-        <a:latin typeface="Aptos"/>
+        <a:latin typeface="Arial"/>
         <a:ea typeface=""/>
         <a:cs typeface=""/>
         <a:font script="Jpan" typeface="ＭＳ 明朝"/>

</xml_diff>